<commit_message>
Added screenshots and updated readme with API stuffs
</commit_message>
<xml_diff>
--- a/QAs/Code_Review_Architecture_QA.docx
+++ b/QAs/Code_Review_Architecture_QA.docx
@@ -71,10 +71,7 @@
         <w:t>Authentication &amp; authorization</w:t>
       </w:r>
       <w:r>
-        <w:t>: strong password policies (or delegate to an identity provider), MFA where</w:t>
-      </w:r>
-      <w:r>
-        <w:t xml:space="preserve"> possible, short-lived JWT access tokens with rotating refresh tokens, and role/claim-based authorization enforced server-side on every endpoint — never trust a client-side check alone.</w:t>
+        <w:t>: strong password policies (or delegate to an identity provider), MFA where possible, short-lived JWT access tokens with rotating refresh tokens, and role/claim-based authorization enforced server-side on every endpoint — never trust a client-side check alone.</w:t>
       </w:r>
     </w:p>
     <w:p>
@@ -98,10 +95,7 @@
       </w:r>
       <w:proofErr w:type="spellStart"/>
       <w:r>
-        <w:t>Fluen</w:t>
-      </w:r>
-      <w:r>
-        <w:t>tValidation</w:t>
+        <w:t>FluentValidation</w:t>
       </w:r>
       <w:proofErr w:type="spellEnd"/>
       <w:r>
@@ -133,10 +127,7 @@
       </w:r>
       <w:proofErr w:type="spellEnd"/>
       <w:r>
-        <w:t>/secure cookies where applicable,</w:t>
-      </w:r>
-      <w:r>
-        <w:t xml:space="preserve"> and invalidate sessions/refresh tokens on logout.</w:t>
+        <w:t>/secure cookies where applicable, and invalidate sessions/refresh tokens on logout.</w:t>
       </w:r>
     </w:p>
     <w:p>
@@ -156,10 +147,7 @@
         <w:t>Secrets management</w:t>
       </w:r>
       <w:r>
-        <w:t>: never commit secrets to source control — use environment variables, user-secrets locally, or a managed vault (Azure Key Vault) in production; fail startup loudly if a required secret is</w:t>
-      </w:r>
-      <w:r>
-        <w:t xml:space="preserve"> missing.</w:t>
+        <w:t>: never commit secrets to source control — use environment variables, user-secrets locally, or a managed vault (Azure Key Vault) in production; fail startup loudly if a required secret is missing.</w:t>
       </w:r>
     </w:p>
     <w:p>
@@ -242,24 +230,10 @@
           <w:szCs w:val="20"/>
           <w:shd w:val="clear" w:color="auto" w:fill="F0F0F0"/>
         </w:rPr>
-        <w:t xml:space="preserve"> </w:t>
-      </w:r>
-      <w:proofErr w:type="gramStart"/>
-      <w:r>
-        <w:rPr>
-          <w:rFonts w:ascii="Consolas" w:eastAsia="Consolas" w:hAnsi="Consolas" w:cs="Consolas"/>
-          <w:sz w:val="20"/>
-          <w:szCs w:val="20"/>
-          <w:shd w:val="clear" w:color="auto" w:fill="F0F0F0"/>
-        </w:rPr>
-        <w:t>audit</w:t>
-      </w:r>
-      <w:proofErr w:type="gramEnd"/>
-      <w:r>
-        <w:t>) regularly and</w:t>
-      </w:r>
-      <w:r>
-        <w:t xml:space="preserve"> patch promptly — most real-world breaches exploit known, unpatched CVEs.</w:t>
+        <w:t xml:space="preserve"> audit</w:t>
+      </w:r>
+      <w:r>
+        <w:t>) regularly and patch promptly — most real-world breaches exploit known, unpatched CVEs.</w:t>
       </w:r>
     </w:p>
     <w:p>
@@ -299,10 +273,7 @@
         <w:t>Observability</w:t>
       </w:r>
       <w:r>
-        <w:t>: centralized logging and alert</w:t>
-      </w:r>
-      <w:r>
-        <w:t>ing so suspicious activity (repeated failed logins, unusual traffic) is caught quickly, plus periodic security review or penetration testing for anything handling sensitive data.</w:t>
+        <w:t>: centralized logging and alerting so suspicious activity (repeated failed logins, unusual traffic) is caught quickly, plus periodic security review or penetration testing for anything handling sensitive data.</w:t>
       </w:r>
     </w:p>
     <w:p>
@@ -318,16 +289,7 @@
         <w:spacing w:after="140"/>
       </w:pPr>
       <w:r>
-        <w:t>I would</w:t>
-      </w:r>
-      <w:r>
-        <w:t xml:space="preserve"> never optimize blind — </w:t>
-      </w:r>
-      <w:r>
-        <w:t xml:space="preserve">the first step is always profiling </w:t>
-      </w:r>
-      <w:r>
-        <w:t xml:space="preserve">(React </w:t>
+        <w:t xml:space="preserve">I would never optimize blind — the first step is always profiling (React </w:t>
       </w:r>
       <w:proofErr w:type="spellStart"/>
       <w:r>
@@ -335,10 +297,7 @@
       </w:r>
       <w:proofErr w:type="spellEnd"/>
       <w:r>
-        <w:t xml:space="preserve"> Profiler, Chrome Performance tab, Lighthouse) to find where time is actually going, since the fix for a slow network request is completely different from the fix for an expensive re</w:t>
-      </w:r>
-      <w:r>
-        <w:t>-render. From there, common levers:</w:t>
+        <w:t xml:space="preserve"> Profiler, Chrome Performance tab, Lighthouse) to find where time is actually going, since the fix for a slow network request is completely different from the fix for an expensive re-render. From there, common levers:</w:t>
       </w:r>
     </w:p>
     <w:p>
@@ -400,10 +359,7 @@
       </w:r>
       <w:proofErr w:type="spellEnd"/>
       <w:r>
-        <w:t xml:space="preserve"> so children do not re-render on every parent update. Split large contexts so a change to one slice of sta</w:t>
-      </w:r>
-      <w:r>
-        <w:t>te does not re-render every consumer.</w:t>
+        <w:t xml:space="preserve"> so children do not re-render on every parent update. Split large contexts so a change to one slice of state does not re-render every consumer.</w:t>
       </w:r>
     </w:p>
     <w:p>
@@ -493,10 +449,7 @@
         <w:t>react-virtualized</w:t>
       </w:r>
       <w:r>
-        <w:t>) in</w:t>
-      </w:r>
-      <w:r>
-        <w:t>stead of rendering thousands of DOM nodes at once.</w:t>
+        <w:t>) instead of rendering thousands of DOM nodes at once.</w:t>
       </w:r>
     </w:p>
     <w:p>
@@ -533,10 +486,7 @@
       </w:r>
       <w:proofErr w:type="spellEnd"/>
       <w:r>
-        <w:t>/throttle handlers tied to frequent events (searc</w:t>
-      </w:r>
-      <w:r>
-        <w:t>h-as-you-type, scroll, resize).</w:t>
+        <w:t>/throttle handlers tied to frequent events (search-as-you-type, scroll, resize).</w:t>
       </w:r>
     </w:p>
     <w:p>
@@ -588,10 +538,7 @@
         <w:t>Assets</w:t>
       </w:r>
       <w:r>
-        <w:t>: lazy-load and serve appropriately s</w:t>
-      </w:r>
-      <w:r>
-        <w:t>ized/modern-format images; they are frequently the single biggest contributor to a slow first paint.</w:t>
+        <w:t>: lazy-load and serve appropriately sized/modern-format images; they are frequently the single biggest contributor to a slow first paint.</w:t>
       </w:r>
     </w:p>
     <w:p>
@@ -607,10 +554,7 @@
         <w:pStyle w:val="Heading1"/>
       </w:pPr>
       <w:r>
-        <w:t>3. Explain the diffe</w:t>
-      </w:r>
-      <w:r>
-        <w:t>rence between SQL and NoSQL databases and when you would use each.</w:t>
+        <w:t>3. Explain the difference between SQL and NoSQL databases and when you would use each.</w:t>
       </w:r>
     </w:p>
     <w:p>
@@ -625,10 +569,7 @@
         <w:t>SQL (relational)</w:t>
       </w:r>
       <w:r>
-        <w:t xml:space="preserve"> databases — PostgreSQL, SQL Server, MySQL — store data in tables with a fixed schema and enforce relationships via foreign keys. They provide ACID transactions and strong c</w:t>
-      </w:r>
-      <w:r>
-        <w:t>onsistency, and are built for complex queries and joins across related entities. I use a relational database (SQL Server + EF Core, as in this project) when the data is genuinely relational — users,</w:t>
+        <w:t xml:space="preserve"> databases — PostgreSQL, SQL Server, MySQL — store data in tables with a fixed schema and enforce relationships via foreign keys. They provide ACID transactions and strong consistency, and are built for complex queries and joins across related entities. I use a relational database (SQL Server + EF Core, as in this project) when the data is genuinely relational — users,</w:t>
       </w:r>
       <w:r>
         <w:t xml:space="preserve"> roles, and their owned records.</w:t>
@@ -654,13 +595,7 @@
       </w:r>
       <w:proofErr w:type="spellEnd"/>
       <w:r>
-        <w:t>), column-fam</w:t>
-      </w:r>
-      <w:r>
-        <w:t xml:space="preserve">ily (Cassandra), and graph (Neo4j) — and trade some consistency guarantees for flexibility and horizontal scale. They do not require a fixed schema up front, which suits data whose shape evolves or varies per record, and they are built to scale out across </w:t>
-      </w:r>
-      <w:r>
-        <w:t>many nodes for very high read/write throughput.</w:t>
+        <w:t>), column-family (Cassandra), and graph (Neo4j) — and trade some consistency guarantees for flexibility and horizontal scale. They do not require a fixed schema up front, which suits data whose shape evolves or varies per record, and they are built to scale out across many nodes for very high read/write throughput.</w:t>
       </w:r>
     </w:p>
     <w:p>
@@ -676,13 +611,7 @@
       </w:r>
       <w:proofErr w:type="spellEnd"/>
       <w:r>
-        <w:t xml:space="preserve"> events), caching layers needing sub-millisecond key lookups, content with </w:t>
-      </w:r>
-      <w:r>
-        <w:t>a flexible or evolving shape (a CMS with varying document structures), or graph-shaped data like social connections. The practical decision usually comes down to: do I need joins and transactional consistency across related records (SQL), or do I need to s</w:t>
-      </w:r>
-      <w:r>
-        <w:t>cale horizontally and store loosely structured, high-volume data (NoSQL)? Many real systems use both — a relational store for core business data and a NoSQL store for caching or logging alongside it.</w:t>
+        <w:t xml:space="preserve"> events), caching layers needing sub-millisecond key lookups, content with a flexible or evolving shape (a CMS with varying document structures), or graph-shaped data like social connections. The practical decision usually comes down to: do I need joins and transactional consistency across related records (SQL), or do I need to scale horizontally and store loosely structured, high-volume data (NoSQL)? Many real systems use both — a relational store for core business data and a NoSQL store for caching or logging alongside it.</w:t>
       </w:r>
     </w:p>
     <w:p>
@@ -690,10 +619,7 @@
         <w:pStyle w:val="Heading1"/>
       </w:pPr>
       <w:r>
-        <w:t>4. How would you deploy a full-stack application to Azur</w:t>
-      </w:r>
-      <w:r>
-        <w:t>e?</w:t>
+        <w:t>4. How would you deploy a full-stack application to Azure?</w:t>
       </w:r>
     </w:p>
     <w:p>
@@ -735,10 +661,7 @@
       </w:r>
       <w:proofErr w:type="spellEnd"/>
       <w:r>
-        <w:t>), which ca</w:t>
-      </w:r>
-      <w:r>
-        <w:t xml:space="preserve">n provision and deploy the whole solution from the </w:t>
+        <w:t xml:space="preserve">), which can provision and deploy the whole solution from the </w:t>
       </w:r>
       <w:proofErr w:type="spellStart"/>
       <w:r>
@@ -930,10 +853,7 @@
         <w:t>CI/CD</w:t>
       </w:r>
       <w:r>
-        <w:t>: a GitHub Actions or Azure DevOps pipeline that builds both projects, runs tests, and deploys on p</w:t>
-      </w:r>
-      <w:r>
-        <w:t>ush to main — avoiding manual, inconsistent deploys.</w:t>
+        <w:t>: a GitHub Actions or Azure DevOps pipeline that builds both projects, runs tests, and deploys on push to main — avoiding manual, inconsistent deploys.</w:t>
       </w:r>
     </w:p>
     <w:p>
@@ -953,10 +873,7 @@
         <w:t>Networking &amp; security</w:t>
       </w:r>
       <w:r>
-        <w:t>: configure CORS on the API to allow only the real frontend origin, attach a custom domain with a managed TLS certificate, and put the API behind Azure Front Door or an App Service a</w:t>
-      </w:r>
-      <w:r>
-        <w:t>ccess restriction if it should not be publicly open.</w:t>
+        <w:t>: configure CORS on the API to allow only the real frontend origin, attach a custom domain with a managed TLS certificate, and put the API behind Azure Front Door or an App Service access restriction if it should not be publicly open.</w:t>
       </w:r>
     </w:p>
     <w:p>
@@ -984,10 +901,7 @@
         <w:spacing w:after="140"/>
       </w:pPr>
       <w:r>
-        <w:t>That sequence — provision, configure secrets properly, migrate the datab</w:t>
-      </w:r>
-      <w:r>
-        <w:t xml:space="preserve">ase, automate </w:t>
+        <w:t xml:space="preserve">That sequence — provision, configure secrets properly, migrate the database, automate </w:t>
       </w:r>
       <w:proofErr w:type="gramStart"/>
       <w:r>
@@ -996,6 +910,383 @@
       <w:proofErr w:type="gramEnd"/>
       <w:r>
         <w:t>, then wire up monitoring — covers the practical gaps between "it runs locally" and "it runs safely in production."</w:t>
+      </w:r>
+    </w:p>
+    <w:p>
+      <w:pPr>
+        <w:spacing w:after="140"/>
+      </w:pPr>
+    </w:p>
+    <w:p>
+      <w:pPr>
+        <w:spacing w:after="140"/>
+      </w:pPr>
+    </w:p>
+    <w:p>
+      <w:pPr>
+        <w:spacing w:after="140"/>
+      </w:pPr>
+    </w:p>
+    <w:p>
+      <w:pPr>
+        <w:spacing w:after="140"/>
+      </w:pPr>
+    </w:p>
+    <w:p>
+      <w:pPr>
+        <w:spacing w:after="140"/>
+      </w:pPr>
+    </w:p>
+    <w:p>
+      <w:pPr>
+        <w:spacing w:after="140"/>
+      </w:pPr>
+    </w:p>
+    <w:p>
+      <w:pPr>
+        <w:spacing w:after="140"/>
+      </w:pPr>
+    </w:p>
+    <w:p>
+      <w:pPr>
+        <w:spacing w:after="140"/>
+      </w:pPr>
+    </w:p>
+    <w:p>
+      <w:pPr>
+        <w:spacing w:after="140"/>
+      </w:pPr>
+    </w:p>
+    <w:p>
+      <w:pPr>
+        <w:spacing w:after="140"/>
+      </w:pPr>
+    </w:p>
+    <w:p>
+      <w:pPr>
+        <w:spacing w:after="140"/>
+      </w:pPr>
+    </w:p>
+    <w:p>
+      <w:pPr>
+        <w:spacing w:after="140"/>
+      </w:pPr>
+    </w:p>
+    <w:p>
+      <w:pPr>
+        <w:spacing w:after="140"/>
+      </w:pPr>
+    </w:p>
+    <w:p>
+      <w:pPr>
+        <w:spacing w:after="140"/>
+      </w:pPr>
+    </w:p>
+    <w:p>
+      <w:pPr>
+        <w:spacing w:after="140"/>
+      </w:pPr>
+    </w:p>
+    <w:p>
+      <w:pPr>
+        <w:spacing w:after="140"/>
+      </w:pPr>
+    </w:p>
+    <w:p>
+      <w:pPr>
+        <w:spacing w:after="140"/>
+      </w:pPr>
+    </w:p>
+    <w:p>
+      <w:pPr>
+        <w:spacing w:after="140"/>
+      </w:pPr>
+    </w:p>
+    <w:p>
+      <w:pPr>
+        <w:spacing w:after="140"/>
+      </w:pPr>
+    </w:p>
+    <w:p>
+      <w:pPr>
+        <w:spacing w:after="140"/>
+      </w:pPr>
+    </w:p>
+    <w:p>
+      <w:pPr>
+        <w:spacing w:after="140"/>
+      </w:pPr>
+    </w:p>
+    <w:p>
+      <w:pPr>
+        <w:pStyle w:val="Title"/>
+      </w:pPr>
+      <w:r>
+        <w:lastRenderedPageBreak/>
+        <w:t>Screenshots</w:t>
+      </w:r>
+    </w:p>
+    <w:p>
+      <w:pPr>
+        <w:pStyle w:val="Heading1"/>
+      </w:pPr>
+      <w:r>
+        <w:t>First UI</w:t>
+      </w:r>
+    </w:p>
+    <w:p>
+      <w:pPr>
+        <w:spacing w:after="140"/>
+      </w:pPr>
+      <w:r>
+        <w:rPr>
+          <w:noProof/>
+        </w:rPr>
+        <w:drawing>
+          <wp:inline distT="0" distB="0" distL="0" distR="0" wp14:anchorId="065F8377" wp14:editId="41D43A94">
+            <wp:extent cx="5943600" cy="2705100"/>
+            <wp:effectExtent l="0" t="0" r="0" b="0"/>
+            <wp:docPr id="1" name="Picture 1"/>
+            <wp:cNvGraphicFramePr>
+              <a:graphicFrameLocks xmlns:a="http://schemas.openxmlformats.org/drawingml/2006/main" noChangeAspect="1"/>
+            </wp:cNvGraphicFramePr>
+            <a:graphic xmlns:a="http://schemas.openxmlformats.org/drawingml/2006/main">
+              <a:graphicData uri="http://schemas.openxmlformats.org/drawingml/2006/picture">
+                <pic:pic xmlns:pic="http://schemas.openxmlformats.org/drawingml/2006/picture">
+                  <pic:nvPicPr>
+                    <pic:cNvPr id="1" name=""/>
+                    <pic:cNvPicPr/>
+                  </pic:nvPicPr>
+                  <pic:blipFill>
+                    <a:blip r:embed="rId5"/>
+                    <a:stretch>
+                      <a:fillRect/>
+                    </a:stretch>
+                  </pic:blipFill>
+                  <pic:spPr>
+                    <a:xfrm>
+                      <a:off x="0" y="0"/>
+                      <a:ext cx="5943600" cy="2705100"/>
+                    </a:xfrm>
+                    <a:prstGeom prst="rect">
+                      <a:avLst/>
+                    </a:prstGeom>
+                  </pic:spPr>
+                </pic:pic>
+              </a:graphicData>
+            </a:graphic>
+          </wp:inline>
+        </w:drawing>
+      </w:r>
+    </w:p>
+    <w:p>
+      <w:pPr>
+        <w:spacing w:after="140"/>
+      </w:pPr>
+    </w:p>
+    <w:p>
+      <w:pPr>
+        <w:pStyle w:val="Heading1"/>
+      </w:pPr>
+      <w:r>
+        <w:t xml:space="preserve">API Integrations </w:t>
+      </w:r>
+    </w:p>
+    <w:p>
+      <w:pPr>
+        <w:spacing w:after="140"/>
+      </w:pPr>
+    </w:p>
+    <w:p>
+      <w:pPr>
+        <w:spacing w:after="140"/>
+      </w:pPr>
+      <w:r>
+        <w:rPr>
+          <w:noProof/>
+        </w:rPr>
+        <w:drawing>
+          <wp:inline distT="0" distB="0" distL="0" distR="0" wp14:anchorId="6B95A08C" wp14:editId="48061434">
+            <wp:extent cx="5943600" cy="2927350"/>
+            <wp:effectExtent l="0" t="0" r="0" b="6350"/>
+            <wp:docPr id="2" name="Picture 2"/>
+            <wp:cNvGraphicFramePr>
+              <a:graphicFrameLocks xmlns:a="http://schemas.openxmlformats.org/drawingml/2006/main" noChangeAspect="1"/>
+            </wp:cNvGraphicFramePr>
+            <a:graphic xmlns:a="http://schemas.openxmlformats.org/drawingml/2006/main">
+              <a:graphicData uri="http://schemas.openxmlformats.org/drawingml/2006/picture">
+                <pic:pic xmlns:pic="http://schemas.openxmlformats.org/drawingml/2006/picture">
+                  <pic:nvPicPr>
+                    <pic:cNvPr id="1" name=""/>
+                    <pic:cNvPicPr/>
+                  </pic:nvPicPr>
+                  <pic:blipFill>
+                    <a:blip r:embed="rId6"/>
+                    <a:stretch>
+                      <a:fillRect/>
+                    </a:stretch>
+                  </pic:blipFill>
+                  <pic:spPr>
+                    <a:xfrm>
+                      <a:off x="0" y="0"/>
+                      <a:ext cx="5943600" cy="2927350"/>
+                    </a:xfrm>
+                    <a:prstGeom prst="rect">
+                      <a:avLst/>
+                    </a:prstGeom>
+                  </pic:spPr>
+                </pic:pic>
+              </a:graphicData>
+            </a:graphic>
+          </wp:inline>
+        </w:drawing>
+      </w:r>
+    </w:p>
+    <w:p>
+      <w:pPr>
+        <w:spacing w:after="140"/>
+      </w:pPr>
+    </w:p>
+    <w:p>
+      <w:pPr>
+        <w:spacing w:after="140"/>
+      </w:pPr>
+    </w:p>
+    <w:p>
+      <w:pPr>
+        <w:spacing w:after="140"/>
+      </w:pPr>
+    </w:p>
+    <w:p>
+      <w:pPr>
+        <w:pStyle w:val="Heading1"/>
+      </w:pPr>
+      <w:r>
+        <w:t>Task List</w:t>
+      </w:r>
+    </w:p>
+    <w:p>
+      <w:pPr>
+        <w:spacing w:after="140"/>
+      </w:pPr>
+    </w:p>
+    <w:p>
+      <w:pPr>
+        <w:spacing w:after="140"/>
+      </w:pPr>
+      <w:r>
+        <w:rPr>
+          <w:noProof/>
+        </w:rPr>
+        <w:drawing>
+          <wp:inline distT="0" distB="0" distL="0" distR="0" wp14:anchorId="2783F474" wp14:editId="7B55CAF7">
+            <wp:extent cx="5943600" cy="2301875"/>
+            <wp:effectExtent l="0" t="0" r="0" b="3175"/>
+            <wp:docPr id="3" name="Picture 3"/>
+            <wp:cNvGraphicFramePr>
+              <a:graphicFrameLocks xmlns:a="http://schemas.openxmlformats.org/drawingml/2006/main" noChangeAspect="1"/>
+            </wp:cNvGraphicFramePr>
+            <a:graphic xmlns:a="http://schemas.openxmlformats.org/drawingml/2006/main">
+              <a:graphicData uri="http://schemas.openxmlformats.org/drawingml/2006/picture">
+                <pic:pic xmlns:pic="http://schemas.openxmlformats.org/drawingml/2006/picture">
+                  <pic:nvPicPr>
+                    <pic:cNvPr id="1" name=""/>
+                    <pic:cNvPicPr/>
+                  </pic:nvPicPr>
+                  <pic:blipFill>
+                    <a:blip r:embed="rId7"/>
+                    <a:stretch>
+                      <a:fillRect/>
+                    </a:stretch>
+                  </pic:blipFill>
+                  <pic:spPr>
+                    <a:xfrm>
+                      <a:off x="0" y="0"/>
+                      <a:ext cx="5943600" cy="2301875"/>
+                    </a:xfrm>
+                    <a:prstGeom prst="rect">
+                      <a:avLst/>
+                    </a:prstGeom>
+                  </pic:spPr>
+                </pic:pic>
+              </a:graphicData>
+            </a:graphic>
+          </wp:inline>
+        </w:drawing>
+      </w:r>
+    </w:p>
+    <w:p>
+      <w:pPr>
+        <w:spacing w:after="140"/>
+      </w:pPr>
+    </w:p>
+    <w:p>
+      <w:pPr>
+        <w:pStyle w:val="Heading1"/>
+      </w:pPr>
+      <w:r>
+        <w:t>Task History</w:t>
+      </w:r>
+    </w:p>
+    <w:p>
+      <w:pPr>
+        <w:spacing w:after="140"/>
+      </w:pPr>
+    </w:p>
+    <w:p>
+      <w:pPr>
+        <w:spacing w:after="140"/>
+      </w:pPr>
+      <w:r>
+        <w:rPr>
+          <w:noProof/>
+        </w:rPr>
+        <w:drawing>
+          <wp:inline distT="0" distB="0" distL="0" distR="0" wp14:anchorId="13740066" wp14:editId="3724E151">
+            <wp:extent cx="5943600" cy="2698115"/>
+            <wp:effectExtent l="0" t="0" r="0" b="6985"/>
+            <wp:docPr id="4" name="Picture 4"/>
+            <wp:cNvGraphicFramePr>
+              <a:graphicFrameLocks xmlns:a="http://schemas.openxmlformats.org/drawingml/2006/main" noChangeAspect="1"/>
+            </wp:cNvGraphicFramePr>
+            <a:graphic xmlns:a="http://schemas.openxmlformats.org/drawingml/2006/main">
+              <a:graphicData uri="http://schemas.openxmlformats.org/drawingml/2006/picture">
+                <pic:pic xmlns:pic="http://schemas.openxmlformats.org/drawingml/2006/picture">
+                  <pic:nvPicPr>
+                    <pic:cNvPr id="1" name=""/>
+                    <pic:cNvPicPr/>
+                  </pic:nvPicPr>
+                  <pic:blipFill>
+                    <a:blip r:embed="rId8"/>
+                    <a:stretch>
+                      <a:fillRect/>
+                    </a:stretch>
+                  </pic:blipFill>
+                  <pic:spPr>
+                    <a:xfrm>
+                      <a:off x="0" y="0"/>
+                      <a:ext cx="5943600" cy="2698115"/>
+                    </a:xfrm>
+                    <a:prstGeom prst="rect">
+                      <a:avLst/>
+                    </a:prstGeom>
+                  </pic:spPr>
+                </pic:pic>
+              </a:graphicData>
+            </a:graphic>
+          </wp:inline>
+        </w:drawing>
+      </w:r>
+    </w:p>
+    <w:p>
+      <w:pPr>
+        <w:spacing w:after="140"/>
+      </w:pPr>
+      <w:r>
+        <w:br/>
+      </w:r>
+      <w:r>
+        <w:br/>
       </w:r>
       <w:bookmarkStart w:id="0" w:name="_GoBack"/>
       <w:bookmarkEnd w:id="0"/>

</xml_diff>